<commit_message>
update packages and scripts
</commit_message>
<xml_diff>
--- a/html/github.docx
+++ b/html/github.docx
@@ -2,6 +2,162 @@
 <file path=word/document.xml><?xml version="1.0" encoding="utf-8"?>
 <w:document xmlns:wpc="http://schemas.microsoft.com/office/word/2010/wordprocessingCanvas" xmlns:cx="http://schemas.microsoft.com/office/drawing/2014/chartex" xmlns:cx1="http://schemas.microsoft.com/office/drawing/2015/9/8/chartex" xmlns:cx2="http://schemas.microsoft.com/office/drawing/2015/10/21/chartex" xmlns:cx3="http://schemas.microsoft.com/office/drawing/2016/5/9/chartex" xmlns:cx4="http://schemas.microsoft.com/office/drawing/2016/5/10/chartex" xmlns:cx5="http://schemas.microsoft.com/office/drawing/2016/5/11/chartex" xmlns:cx6="http://schemas.microsoft.com/office/drawing/2016/5/12/chartex" xmlns:cx7="http://schemas.microsoft.com/office/drawing/2016/5/13/chartex" xmlns:cx8="http://schemas.microsoft.com/office/drawing/2016/5/14/chartex" xmlns:mc="http://schemas.openxmlformats.org/markup-compatibility/2006" xmlns:aink="http://schemas.microsoft.com/office/drawing/2016/ink" xmlns:am3d="http://schemas.microsoft.com/office/drawing/2017/model3d" xmlns:o="urn:schemas-microsoft-com:office:office" xmlns:oel="http://schemas.microsoft.com/office/2019/extlst" xmlns:r="http://schemas.openxmlformats.org/officeDocument/2006/relationships" xmlns:m="http://schemas.openxmlformats.org/officeDocument/2006/math" xmlns:v="urn:schemas-microsoft-com:vml" xmlns:wp14="http://schemas.microsoft.com/office/word/2010/wordprocessingDrawing" xmlns:wp="http://schemas.openxmlformats.org/drawingml/2006/wordprocessingDrawing" xmlns:w10="urn:schemas-microsoft-com:office:word" xmlns:w="http://schemas.openxmlformats.org/wordprocessingml/2006/main" xmlns:w14="http://schemas.microsoft.com/office/word/2010/wordml" xmlns:w15="http://schemas.microsoft.com/office/word/2012/wordml" xmlns:w16cex="http://schemas.microsoft.com/office/word/2018/wordml/cex" xmlns:w16cid="http://schemas.microsoft.com/office/word/2016/wordml/cid" xmlns:w16="http://schemas.microsoft.com/office/word/2018/wordml" xmlns:w16du="http://schemas.microsoft.com/office/word/2023/wordml/word16du" xmlns:w16sdtdh="http://schemas.microsoft.com/office/word/2020/wordml/sdtdatahash" xmlns:w16sdtfl="http://schemas.microsoft.com/office/word/2024/wordml/sdtformatlock" xmlns:w16se="http://schemas.microsoft.com/office/word/2015/wordml/symex" xmlns:wpg="http://schemas.microsoft.com/office/word/2010/wordprocessingGroup" xmlns:wpi="http://schemas.microsoft.com/office/word/2010/wordprocessingInk" xmlns:wne="http://schemas.microsoft.com/office/word/2006/wordml" xmlns:wps="http://schemas.microsoft.com/office/word/2010/wordprocessingShape" mc:Ignorable="w14 w15 w16se w16cid w16 w16cex w16sdtdh w16sdtfl w16du wp14">
   <w:body>
+    <w:p>
+      <w:pPr>
+        <w:pStyle w:val="FirstParagraph"/>
+        <w:contextualSpacing/>
+      </w:pPr>
+      <w:r>
+        <w:rPr>
+          <w:noProof/>
+        </w:rPr>
+        <w:drawing>
+          <wp:anchor distT="0" distB="0" distL="114300" distR="114300" simplePos="0" relativeHeight="251659776" behindDoc="1" locked="0" layoutInCell="1" allowOverlap="1" wp14:anchorId="0071248E" wp14:editId="60473745">
+            <wp:simplePos x="0" y="0"/>
+            <wp:positionH relativeFrom="column">
+              <wp:posOffset>4170875</wp:posOffset>
+            </wp:positionH>
+            <wp:positionV relativeFrom="paragraph">
+              <wp:posOffset>-3502</wp:posOffset>
+            </wp:positionV>
+            <wp:extent cx="733331" cy="733331"/>
+            <wp:effectExtent l="0" t="0" r="0" b="0"/>
+            <wp:wrapNone/>
+            <wp:docPr id="78383272" name="Picture 2"/>
+            <wp:cNvGraphicFramePr>
+              <a:graphicFrameLocks xmlns:a="http://schemas.openxmlformats.org/drawingml/2006/main" noChangeAspect="1"/>
+            </wp:cNvGraphicFramePr>
+            <a:graphic xmlns:a="http://schemas.openxmlformats.org/drawingml/2006/main">
+              <a:graphicData uri="http://schemas.openxmlformats.org/drawingml/2006/picture">
+                <pic:pic xmlns:pic="http://schemas.openxmlformats.org/drawingml/2006/picture">
+                  <pic:nvPicPr>
+                    <pic:cNvPr id="78383272" name="Picture 78383272"/>
+                    <pic:cNvPicPr/>
+                  </pic:nvPicPr>
+                  <pic:blipFill>
+                    <a:blip r:embed="rId5" cstate="print">
+                      <a:extLst>
+                        <a:ext uri="{28A0092B-C50C-407E-A947-70E740481C1C}">
+                          <a14:useLocalDpi xmlns:a14="http://schemas.microsoft.com/office/drawing/2010/main" val="0"/>
+                        </a:ext>
+                      </a:extLst>
+                    </a:blip>
+                    <a:stretch>
+                      <a:fillRect/>
+                    </a:stretch>
+                  </pic:blipFill>
+                  <pic:spPr>
+                    <a:xfrm>
+                      <a:off x="0" y="0"/>
+                      <a:ext cx="735947" cy="735947"/>
+                    </a:xfrm>
+                    <a:prstGeom prst="rect">
+                      <a:avLst/>
+                    </a:prstGeom>
+                  </pic:spPr>
+                </pic:pic>
+              </a:graphicData>
+            </a:graphic>
+            <wp14:sizeRelH relativeFrom="margin">
+              <wp14:pctWidth>0</wp14:pctWidth>
+            </wp14:sizeRelH>
+            <wp14:sizeRelV relativeFrom="margin">
+              <wp14:pctHeight>0</wp14:pctHeight>
+            </wp14:sizeRelV>
+          </wp:anchor>
+        </w:drawing>
+      </w:r>
+      <w:r>
+        <w:rPr>
+          <w:noProof/>
+        </w:rPr>
+        <w:drawing>
+          <wp:anchor distT="0" distB="0" distL="114300" distR="114300" simplePos="0" relativeHeight="251655680" behindDoc="1" locked="0" layoutInCell="1" allowOverlap="1" wp14:anchorId="5339C0EA" wp14:editId="1C60257E">
+            <wp:simplePos x="0" y="0"/>
+            <wp:positionH relativeFrom="column">
+              <wp:posOffset>3274368</wp:posOffset>
+            </wp:positionH>
+            <wp:positionV relativeFrom="paragraph">
+              <wp:posOffset>122718</wp:posOffset>
+            </wp:positionV>
+            <wp:extent cx="712131" cy="579422"/>
+            <wp:effectExtent l="0" t="0" r="0" b="0"/>
+            <wp:wrapNone/>
+            <wp:docPr id="1216378556" name="Picture 1"/>
+            <wp:cNvGraphicFramePr>
+              <a:graphicFrameLocks xmlns:a="http://schemas.openxmlformats.org/drawingml/2006/main" noChangeAspect="1"/>
+            </wp:cNvGraphicFramePr>
+            <a:graphic xmlns:a="http://schemas.openxmlformats.org/drawingml/2006/main">
+              <a:graphicData uri="http://schemas.openxmlformats.org/drawingml/2006/picture">
+                <pic:pic xmlns:pic="http://schemas.openxmlformats.org/drawingml/2006/picture">
+                  <pic:nvPicPr>
+                    <pic:cNvPr id="1216378556" name="Picture 1216378556"/>
+                    <pic:cNvPicPr/>
+                  </pic:nvPicPr>
+                  <pic:blipFill>
+                    <a:blip r:embed="rId6" cstate="print">
+                      <a:extLst>
+                        <a:ext uri="{28A0092B-C50C-407E-A947-70E740481C1C}">
+                          <a14:useLocalDpi xmlns:a14="http://schemas.microsoft.com/office/drawing/2010/main" val="0"/>
+                        </a:ext>
+                      </a:extLst>
+                    </a:blip>
+                    <a:stretch>
+                      <a:fillRect/>
+                    </a:stretch>
+                  </pic:blipFill>
+                  <pic:spPr>
+                    <a:xfrm>
+                      <a:off x="0" y="0"/>
+                      <a:ext cx="712131" cy="579422"/>
+                    </a:xfrm>
+                    <a:prstGeom prst="rect">
+                      <a:avLst/>
+                    </a:prstGeom>
+                  </pic:spPr>
+                </pic:pic>
+              </a:graphicData>
+            </a:graphic>
+            <wp14:sizeRelH relativeFrom="margin">
+              <wp14:pctWidth>0</wp14:pctWidth>
+            </wp14:sizeRelH>
+            <wp14:sizeRelV relativeFrom="margin">
+              <wp14:pctHeight>0</wp14:pctHeight>
+            </wp14:sizeRelV>
+          </wp:anchor>
+        </w:drawing>
+      </w:r>
+      <w:r>
+        <w:t>Escuela de Ciencias Biológicas</w:t>
+      </w:r>
+    </w:p>
+    <w:p>
+      <w:pPr>
+        <w:pStyle w:val="FirstParagraph"/>
+        <w:contextualSpacing/>
+      </w:pPr>
+      <w:r>
+        <w:t>Universidad Nacional</w:t>
+      </w:r>
+    </w:p>
+    <w:p>
+      <w:pPr>
+        <w:pStyle w:val="FirstParagraph"/>
+        <w:contextualSpacing/>
+      </w:pPr>
+      <w:r>
+        <w:t>Ecología de Poblaciones y Comunidades</w:t>
+      </w:r>
+    </w:p>
+    <w:p>
+      <w:pPr>
+        <w:pStyle w:val="FirstParagraph"/>
+        <w:contextualSpacing/>
+      </w:pPr>
+      <w:r>
+        <w:t>Profesor: Héctor Zumbado Ulate</w:t>
+      </w:r>
+    </w:p>
     <w:p>
       <w:pPr>
         <w:pStyle w:val="Title"/>
@@ -26,7 +182,7 @@
           <w:sz w:val="24"/>
           <w:szCs w:val="24"/>
         </w:rPr>
-        <w:id w:val="1816534506"/>
+        <w:id w:val="1687175808"/>
         <w:docPartObj>
           <w:docPartGallery w:val="Table of Contents"/>
           <w:docPartUnique/>
@@ -49,9 +205,6 @@
             </w:tabs>
             <w:rPr>
               <w:noProof/>
-              <w:kern w:val="2"/>
-              <w:lang w:val="es-CR" w:eastAsia="es-CR"/>
-              <w14:ligatures w14:val="standardContextual"/>
             </w:rPr>
           </w:pPr>
           <w:r>
@@ -63,7 +216,7 @@
           <w:r>
             <w:fldChar w:fldCharType="separate"/>
           </w:r>
-          <w:hyperlink w:anchor="_Toc235985407" w:history="1">
+          <w:hyperlink w:anchor="_Toc236073827" w:history="1">
             <w:r>
               <w:rPr>
                 <w:rStyle w:val="Hyperlink"/>
@@ -90,7 +243,7 @@
                 <w:noProof/>
                 <w:webHidden/>
               </w:rPr>
-              <w:instrText xml:space="preserve"> PAGEREF _Toc235985407 \h </w:instrText>
+              <w:instrText xml:space="preserve"> PAGEREF _Toc236073827 \h </w:instrText>
             </w:r>
             <w:r>
               <w:rPr>
@@ -129,12 +282,9 @@
             </w:tabs>
             <w:rPr>
               <w:noProof/>
-              <w:kern w:val="2"/>
-              <w:lang w:val="es-CR" w:eastAsia="es-CR"/>
-              <w14:ligatures w14:val="standardContextual"/>
             </w:rPr>
           </w:pPr>
-          <w:hyperlink w:anchor="_Toc235985408" w:history="1">
+          <w:hyperlink w:anchor="_Toc236073828" w:history="1">
             <w:r>
               <w:rPr>
                 <w:rStyle w:val="Hyperlink"/>
@@ -161,7 +311,7 @@
                 <w:noProof/>
                 <w:webHidden/>
               </w:rPr>
-              <w:instrText xml:space="preserve"> PAGEREF _Toc235985408 \h </w:instrText>
+              <w:instrText xml:space="preserve"> PAGEREF _Toc236073828 \h </w:instrText>
             </w:r>
             <w:r>
               <w:rPr>
@@ -200,12 +350,9 @@
             </w:tabs>
             <w:rPr>
               <w:noProof/>
-              <w:kern w:val="2"/>
-              <w:lang w:val="es-CR" w:eastAsia="es-CR"/>
-              <w14:ligatures w14:val="standardContextual"/>
             </w:rPr>
           </w:pPr>
-          <w:hyperlink w:anchor="_Toc235985409" w:history="1">
+          <w:hyperlink w:anchor="_Toc236073829" w:history="1">
             <w:r>
               <w:rPr>
                 <w:rStyle w:val="Hyperlink"/>
@@ -232,7 +379,7 @@
                 <w:noProof/>
                 <w:webHidden/>
               </w:rPr>
-              <w:instrText xml:space="preserve"> PAGEREF _Toc235985409 \h </w:instrText>
+              <w:instrText xml:space="preserve"> PAGEREF _Toc236073829 \h </w:instrText>
             </w:r>
             <w:r>
               <w:rPr>
@@ -271,12 +418,9 @@
             </w:tabs>
             <w:rPr>
               <w:noProof/>
-              <w:kern w:val="2"/>
-              <w:lang w:val="es-CR" w:eastAsia="es-CR"/>
-              <w14:ligatures w14:val="standardContextual"/>
             </w:rPr>
           </w:pPr>
-          <w:hyperlink w:anchor="_Toc235985410" w:history="1">
+          <w:hyperlink w:anchor="_Toc236073830" w:history="1">
             <w:r>
               <w:rPr>
                 <w:rStyle w:val="Hyperlink"/>
@@ -303,7 +447,7 @@
                 <w:noProof/>
                 <w:webHidden/>
               </w:rPr>
-              <w:instrText xml:space="preserve"> PAGEREF _Toc235985410 \h </w:instrText>
+              <w:instrText xml:space="preserve"> PAGEREF _Toc236073830 \h </w:instrText>
             </w:r>
             <w:r>
               <w:rPr>
@@ -342,12 +486,9 @@
             </w:tabs>
             <w:rPr>
               <w:noProof/>
-              <w:kern w:val="2"/>
-              <w:lang w:val="es-CR" w:eastAsia="es-CR"/>
-              <w14:ligatures w14:val="standardContextual"/>
             </w:rPr>
           </w:pPr>
-          <w:hyperlink w:anchor="_Toc235985411" w:history="1">
+          <w:hyperlink w:anchor="_Toc236073831" w:history="1">
             <w:r>
               <w:rPr>
                 <w:rStyle w:val="Hyperlink"/>
@@ -374,7 +515,7 @@
                 <w:noProof/>
                 <w:webHidden/>
               </w:rPr>
-              <w:instrText xml:space="preserve"> PAGEREF _Toc235985411 \h </w:instrText>
+              <w:instrText xml:space="preserve"> PAGEREF _Toc236073831 \h </w:instrText>
             </w:r>
             <w:r>
               <w:rPr>
@@ -413,12 +554,9 @@
             </w:tabs>
             <w:rPr>
               <w:noProof/>
-              <w:kern w:val="2"/>
-              <w:lang w:val="es-CR" w:eastAsia="es-CR"/>
-              <w14:ligatures w14:val="standardContextual"/>
             </w:rPr>
           </w:pPr>
-          <w:hyperlink w:anchor="_Toc235985412" w:history="1">
+          <w:hyperlink w:anchor="_Toc236073832" w:history="1">
             <w:r>
               <w:rPr>
                 <w:rStyle w:val="Hyperlink"/>
@@ -426,7 +564,7 @@
                 <w:bCs/>
                 <w:noProof/>
               </w:rPr>
-              <w:t>Lista de Verificación</w:t>
+              <w:t>Lista de verificación</w:t>
             </w:r>
             <w:r>
               <w:rPr>
@@ -447,7 +585,7 @@
                 <w:noProof/>
                 <w:webHidden/>
               </w:rPr>
-              <w:instrText xml:space="preserve"> PAGEREF _Toc235985412 \h </w:instrText>
+              <w:instrText xml:space="preserve"> PAGEREF _Toc236073832 \h </w:instrText>
             </w:r>
             <w:r>
               <w:rPr>
@@ -487,132 +625,48 @@
     </w:sdt>
     <w:p>
       <w:pPr>
+        <w:pStyle w:val="Heading2"/>
+      </w:pPr>
+      <w:bookmarkStart w:id="0" w:name="práctica-1"/>
+      <w:bookmarkStart w:id="1" w:name="_Toc236073827"/>
+      <w:r>
+        <w:t>Práctica 1</w:t>
+      </w:r>
+      <w:bookmarkEnd w:id="1"/>
+    </w:p>
+    <w:p>
+      <w:pPr>
+        <w:pStyle w:val="Heading3"/>
+      </w:pPr>
+      <w:bookmarkStart w:id="2" w:name="objetivo"/>
+      <w:bookmarkStart w:id="3" w:name="_Toc236073828"/>
+      <w:r>
+        <w:t>Objetivo</w:t>
+      </w:r>
+      <w:bookmarkEnd w:id="3"/>
+    </w:p>
+    <w:p>
+      <w:pPr>
         <w:pStyle w:val="FirstParagraph"/>
-        <w:contextualSpacing/>
-      </w:pPr>
-      <w:r>
-        <w:t>Escuela de Ciencias Biológica</w:t>
-      </w:r>
-    </w:p>
-    <w:p>
-      <w:pPr>
-        <w:pStyle w:val="FirstParagraph"/>
-        <w:contextualSpacing/>
-      </w:pPr>
-      <w:r>
-        <w:t>Universidad Nacional</w:t>
-      </w:r>
-    </w:p>
-    <w:p>
-      <w:pPr>
-        <w:pStyle w:val="FirstParagraph"/>
-        <w:contextualSpacing/>
-      </w:pPr>
-      <w:r>
-        <w:t>Ecología de Poblaciones y Comunidades</w:t>
-      </w:r>
-    </w:p>
-    <w:p>
-      <w:pPr>
-        <w:pStyle w:val="FirstParagraph"/>
-        <w:contextualSpacing/>
-      </w:pPr>
-      <w:r>
-        <w:t>Profesor: Héctor Zumbado Ulate</w:t>
+      </w:pPr>
+      <w:r>
+        <w:t>Al finalizar esta práctica, el estudiante será capaz de:</w:t>
+      </w:r>
+    </w:p>
+    <w:p>
+      <w:pPr>
+        <w:pStyle w:val="BodyText"/>
+      </w:pPr>
+      <w:r>
+        <w:t>Configurar Git para trabajar desde RStudio. Crear un repositorio en GitHub. Conectar un proyecto de RStudio con GitHub. Realizar el primer commit y push.</w:t>
       </w:r>
     </w:p>
     <w:p>
       <w:pPr>
         <w:pStyle w:val="Heading2"/>
       </w:pPr>
-      <w:bookmarkStart w:id="0" w:name="práctica-1"/>
-      <w:bookmarkStart w:id="1" w:name="_Toc235985407"/>
-      <w:r>
-        <w:t>Práctica 1</w:t>
-      </w:r>
-      <w:bookmarkEnd w:id="1"/>
-    </w:p>
-    <w:p>
-      <w:pPr>
-        <w:pStyle w:val="Heading3"/>
-      </w:pPr>
-      <w:bookmarkStart w:id="2" w:name="objetivo"/>
-      <w:bookmarkStart w:id="3" w:name="_Toc235985408"/>
-      <w:r>
-        <w:t>Objetivo</w:t>
-      </w:r>
-      <w:bookmarkEnd w:id="3"/>
-    </w:p>
-    <w:p>
-      <w:pPr>
-        <w:pStyle w:val="FirstParagraph"/>
-      </w:pPr>
-      <w:r>
-        <w:t>Al finalizar esta práctica, el estudiante será capaz de:</w:t>
-      </w:r>
-    </w:p>
-    <w:p>
-      <w:pPr>
-        <w:pStyle w:val="BodyText"/>
-        <w:numPr>
-          <w:ilvl w:val="0"/>
-          <w:numId w:val="3"/>
-        </w:numPr>
-      </w:pPr>
-      <w:r>
-        <w:t xml:space="preserve">Configurar Git para trabajar desde RStudio. </w:t>
-      </w:r>
-    </w:p>
-    <w:p>
-      <w:pPr>
-        <w:pStyle w:val="BodyText"/>
-        <w:numPr>
-          <w:ilvl w:val="0"/>
-          <w:numId w:val="3"/>
-        </w:numPr>
-      </w:pPr>
-      <w:r>
-        <w:t xml:space="preserve">Crear un repositorio en GitHub. </w:t>
-      </w:r>
-    </w:p>
-    <w:p>
-      <w:pPr>
-        <w:pStyle w:val="BodyText"/>
-        <w:numPr>
-          <w:ilvl w:val="0"/>
-          <w:numId w:val="3"/>
-        </w:numPr>
-      </w:pPr>
-      <w:r>
-        <w:t xml:space="preserve">Conectar un proyecto de RStudio con GitHub. </w:t>
-      </w:r>
-    </w:p>
-    <w:p>
-      <w:pPr>
-        <w:pStyle w:val="BodyText"/>
-        <w:numPr>
-          <w:ilvl w:val="0"/>
-          <w:numId w:val="3"/>
-        </w:numPr>
-      </w:pPr>
-      <w:r>
-        <w:t xml:space="preserve">Realizar el primer </w:t>
-      </w:r>
-      <w:proofErr w:type="spellStart"/>
-      <w:r>
-        <w:t>commit</w:t>
-      </w:r>
-      <w:proofErr w:type="spellEnd"/>
-      <w:r>
-        <w:t xml:space="preserve"> y push.</w:t>
-      </w:r>
-    </w:p>
-    <w:p>
-      <w:pPr>
-        <w:pStyle w:val="Heading2"/>
-      </w:pPr>
       <w:bookmarkStart w:id="4" w:name="instrucciones"/>
-      <w:bookmarkStart w:id="5" w:name="_Toc235985409"/>
+      <w:bookmarkStart w:id="5" w:name="_Toc236073829"/>
       <w:bookmarkEnd w:id="0"/>
       <w:bookmarkEnd w:id="2"/>
       <w:r>
@@ -624,18 +678,25 @@
       <w:pPr>
         <w:pStyle w:val="FirstParagraph"/>
       </w:pPr>
-      <w:r>
-        <w:t xml:space="preserve">GitHub permite a los usuarios construir repositorios y rastrear los cambios utilizando </w:t>
-      </w:r>
       <w:r>
         <w:rPr>
           <w:b/>
           <w:bCs/>
         </w:rPr>
-        <w:t>git</w:t>
-      </w:r>
-      <w:r>
-        <w:t xml:space="preserve"> (software de control de cambios). Cada vez que ocurre un cambio y este es declarado (commit), GitHub registra una nueva versión del proyecto (snapshot).</w:t>
+        <w:t>Git</w:t>
+      </w:r>
+      <w:r>
+        <w:t xml:space="preserve"> es un sistema de control de versiones instalado en la computadora. </w:t>
+      </w:r>
+      <w:r>
+        <w:rPr>
+          <w:b/>
+          <w:bCs/>
+        </w:rPr>
+        <w:t>GitHub</w:t>
+      </w:r>
+      <w:r>
+        <w:t xml:space="preserve"> es una plataforma remota donde se alojan y comparten repositorios. Cada vez que ocurre un cambio y este es declarado (Commit), GitHub registra una nueva versión del proyecto (snapshot).</w:t>
       </w:r>
     </w:p>
     <w:p>
@@ -643,7 +704,7 @@
         <w:pStyle w:val="Heading3"/>
       </w:pPr>
       <w:bookmarkStart w:id="6" w:name="proceso"/>
-      <w:bookmarkStart w:id="7" w:name="_Toc235985410"/>
+      <w:bookmarkStart w:id="7" w:name="_Toc236073830"/>
       <w:r>
         <w:t>Proceso:</w:t>
       </w:r>
@@ -662,8 +723,16 @@
         <w:pStyle w:val="BodyText"/>
       </w:pPr>
       <w:r>
+        <w:t>2- Seleccionar cambios a declarar (Stage)</w:t>
+      </w:r>
+    </w:p>
+    <w:p>
+      <w:pPr>
+        <w:pStyle w:val="BodyText"/>
+      </w:pPr>
+      <w:r>
         <w:lastRenderedPageBreak/>
-        <w:t>2- Seleccionar cambios a declarar (Stage)</w:t>
+        <w:t>3- Declarar (Commit) y agregar un mensaje útil (Commit message)</w:t>
       </w:r>
     </w:p>
     <w:p>
@@ -671,7 +740,7 @@
         <w:pStyle w:val="BodyText"/>
       </w:pPr>
       <w:r>
-        <w:t>3- Declarar (Commit) y agregar un mensaje util (Commit message)</w:t>
+        <w:t>4- Realizar envíos al repositorio de GitHub desde RStudio (Push)</w:t>
       </w:r>
     </w:p>
     <w:p>
@@ -679,15 +748,7 @@
         <w:pStyle w:val="BodyText"/>
       </w:pPr>
       <w:r>
-        <w:t>4- Realizar envíos al repositorio de GitHub desde RStudio (push)</w:t>
-      </w:r>
-    </w:p>
-    <w:p>
-      <w:pPr>
-        <w:pStyle w:val="BodyText"/>
-      </w:pPr>
-      <w:r>
-        <w:t>5- Recibir información en RStudio desde GitHub (pull)</w:t>
+        <w:t>5- Recibir información en RStudio desde GitHub (Pull)</w:t>
       </w:r>
     </w:p>
     <w:p>
@@ -699,7 +760,7 @@
           <w:noProof/>
         </w:rPr>
         <w:drawing>
-          <wp:inline distT="0" distB="0" distL="0" distR="0" wp14:anchorId="72E62F94" wp14:editId="03BC3D4D">
+          <wp:inline distT="0" distB="0" distL="0" distR="0" wp14:anchorId="5BC72EEF" wp14:editId="03607679">
             <wp:extent cx="5334000" cy="3556000"/>
             <wp:effectExtent l="0" t="0" r="0" b="0"/>
             <wp:docPr id="12" name="Picture"/>
@@ -743,10 +804,18 @@
     </w:p>
     <w:p>
       <w:pPr>
+        <w:pStyle w:val="BodyText"/>
+      </w:pPr>
+      <w:r>
+        <w:t>En esta práctica los cambios se originarán tanto en GitHub como en RStudio para comprender cómo ambos ambientes permanecen sincronizados mediante Git.</w:t>
+      </w:r>
+    </w:p>
+    <w:p>
+      <w:pPr>
         <w:pStyle w:val="Heading2"/>
       </w:pPr>
       <w:bookmarkStart w:id="8" w:name="pasos"/>
-      <w:bookmarkStart w:id="9" w:name="_Toc235985411"/>
+      <w:bookmarkStart w:id="9" w:name="_Toc236073831"/>
       <w:bookmarkEnd w:id="4"/>
       <w:bookmarkEnd w:id="6"/>
       <w:r>
@@ -773,7 +842,7 @@
         </w:numPr>
       </w:pPr>
       <w:r>
-        <w:t>Descargue e Instale Git (</w:t>
+        <w:t>Descargue e instale Git (</w:t>
       </w:r>
       <w:hyperlink r:id="rId8">
         <w:r>
@@ -822,7 +891,7 @@
         </w:rPr>
         <w:lastRenderedPageBreak/>
         <w:drawing>
-          <wp:inline distT="0" distB="0" distL="0" distR="0" wp14:anchorId="67886240" wp14:editId="762E22B0">
+          <wp:inline distT="0" distB="0" distL="0" distR="0" wp14:anchorId="26ADA5CC" wp14:editId="6EBE5288">
             <wp:extent cx="3291840" cy="3733800"/>
             <wp:effectExtent l="0" t="0" r="0" b="0"/>
             <wp:docPr id="18" name="Picture"/>
@@ -872,7 +941,7 @@
         </w:numPr>
       </w:pPr>
       <w:r>
-        <w:t>Genere una clave ssh y agregue a GitHub (opcional pero altamente recomendado). Se recomienda utilizar autenticación mediante claves SSH, ya que evita introducir credenciales cada vez que se envían cambios al repositorio.</w:t>
+        <w:t>Genere una clave SSH (Tools/Global Options/Git SVN) y agréguela a GitHub (opcional pero altamente recomendado). Se recomienda utilizar autenticación mediante claves SSH, ya que evita introducir credenciales cada vez que se envían cambios al repositorio.</w:t>
       </w:r>
     </w:p>
     <w:p>
@@ -883,7 +952,7 @@
         </w:numPr>
       </w:pPr>
       <w:r>
-        <w:t>Crear repositorio en Github con el nombre eco_pc_2026. Siga las indicaciones del profesor.</w:t>
+        <w:t>Crear repositorio en GitHub con el nombre eco_pc_2026. Siga las indicaciones del profesor.</w:t>
       </w:r>
     </w:p>
     <w:p>
@@ -905,7 +974,7 @@
         </w:numPr>
       </w:pPr>
       <w:r>
-        <w:t>Abra una terminal nueva y corra las siguientes lineas una por una:</w:t>
+        <w:t>Abra una terminal nueva y ejecute las siguientes líneas una por una:</w:t>
       </w:r>
     </w:p>
     <w:p>
@@ -934,7 +1003,10 @@
         <w:rPr>
           <w:rStyle w:val="VerbatimChar"/>
         </w:rPr>
-        <w:t>git --version: Comprueba que Git está instalado.</w:t>
+        <w:t>git --version</w:t>
+      </w:r>
+      <w:r>
+        <w:t xml:space="preserve"> #Comprueba que Git está instalado.</w:t>
       </w:r>
     </w:p>
     <w:p>
@@ -949,6 +1021,9 @@
           <w:rStyle w:val="VerbatimChar"/>
         </w:rPr>
         <w:t>git config --global --list</w:t>
+      </w:r>
+      <w:r>
+        <w:t xml:space="preserve"> #información agregada en GitHub</w:t>
       </w:r>
     </w:p>
     <w:p>
@@ -972,34 +1047,15 @@
           <w:ilvl w:val="0"/>
           <w:numId w:val="1"/>
         </w:numPr>
-        <w:rPr>
-          <w:lang w:val="en-US"/>
-        </w:rPr>
       </w:pPr>
       <w:r>
         <w:rPr>
           <w:rStyle w:val="VerbatimChar"/>
-          <w:lang w:val="en-US"/>
         </w:rPr>
-        <w:t xml:space="preserve">git config --global </w:t>
-      </w:r>
-      <w:proofErr w:type="spellStart"/>
-      <w:proofErr w:type="gramStart"/>
-      <w:r>
-        <w:rPr>
-          <w:rStyle w:val="VerbatimChar"/>
-          <w:lang w:val="en-US"/>
-        </w:rPr>
-        <w:t>init.defaultBranch</w:t>
-      </w:r>
-      <w:proofErr w:type="spellEnd"/>
-      <w:proofErr w:type="gramEnd"/>
-      <w:r>
-        <w:rPr>
-          <w:rStyle w:val="VerbatimChar"/>
-          <w:lang w:val="en-US"/>
-        </w:rPr>
-        <w:t xml:space="preserve"> main</w:t>
+        <w:t>git config --global init.defaultBranch main</w:t>
+      </w:r>
+      <w:r>
+        <w:t xml:space="preserve"> #indica que el directorio o rama principal se llama main</w:t>
       </w:r>
     </w:p>
     <w:p>
@@ -1008,34 +1064,15 @@
           <w:ilvl w:val="0"/>
           <w:numId w:val="1"/>
         </w:numPr>
-        <w:rPr>
-          <w:lang w:val="en-US"/>
-        </w:rPr>
       </w:pPr>
       <w:r>
         <w:rPr>
           <w:rStyle w:val="VerbatimChar"/>
-          <w:lang w:val="en-US"/>
         </w:rPr>
-        <w:t xml:space="preserve">git config --global </w:t>
-      </w:r>
-      <w:proofErr w:type="spellStart"/>
-      <w:proofErr w:type="gramStart"/>
-      <w:r>
-        <w:rPr>
-          <w:rStyle w:val="VerbatimChar"/>
-          <w:lang w:val="en-US"/>
-        </w:rPr>
-        <w:t>core.autocrlf</w:t>
-      </w:r>
-      <w:proofErr w:type="spellEnd"/>
-      <w:proofErr w:type="gramEnd"/>
-      <w:r>
-        <w:rPr>
-          <w:rStyle w:val="VerbatimChar"/>
-          <w:lang w:val="en-US"/>
-        </w:rPr>
-        <w:t xml:space="preserve"> true</w:t>
+        <w:t>git config --global core.autocrlf true</w:t>
+      </w:r>
+      <w:r>
+        <w:t xml:space="preserve"> #permite realizar trabajos colaborativos entre computadoras con diferentes sistemas operativos</w:t>
       </w:r>
     </w:p>
     <w:p>
@@ -1050,6 +1087,7 @@
           <w:b/>
           <w:bCs/>
         </w:rPr>
+        <w:lastRenderedPageBreak/>
         <w:t>Identidad</w:t>
       </w:r>
     </w:p>
@@ -1064,11 +1102,10 @@
         <w:rPr>
           <w:rStyle w:val="VerbatimChar"/>
         </w:rPr>
-        <w:lastRenderedPageBreak/>
         <w:t>git config --global user.email "email"</w:t>
       </w:r>
       <w:r>
-        <w:t xml:space="preserve"> #añadir email privado en GitHub</w:t>
+        <w:t xml:space="preserve"> #añade email privado en GitHub</w:t>
       </w:r>
     </w:p>
     <w:p>
@@ -1085,7 +1122,7 @@
         <w:t>git config --global user.name "username"</w:t>
       </w:r>
       <w:r>
-        <w:t xml:space="preserve"> #añadir usuario de Github</w:t>
+        <w:t xml:space="preserve"> #añade usuario de GitHub</w:t>
       </w:r>
     </w:p>
     <w:p>
@@ -1096,7 +1133,7 @@
         </w:numPr>
       </w:pPr>
       <w:r>
-        <w:t>si añadió una clave SSH corra la siguiente línea</w:t>
+        <w:t>si añadió una clave SSH ejecute la siguiente línea</w:t>
       </w:r>
     </w:p>
     <w:p>
@@ -1110,7 +1147,10 @@
         <w:rPr>
           <w:rStyle w:val="VerbatimChar"/>
         </w:rPr>
-        <w:t>ssh -T git@github.com</w:t>
+        <w:t>SSH -T git@github.com</w:t>
+      </w:r>
+      <w:r>
+        <w:t xml:space="preserve"> #Confirma conexión a traves de clave SSH</w:t>
       </w:r>
     </w:p>
     <w:p>
@@ -1121,7 +1161,7 @@
         </w:numPr>
       </w:pPr>
       <w:r>
-        <w:t>Confirme fingerprint</w:t>
+        <w:t>Ejecute las línes que aparecen en GitHub</w:t>
       </w:r>
     </w:p>
     <w:p>
@@ -1132,7 +1172,13 @@
         </w:numPr>
       </w:pPr>
       <w:r>
-        <w:t>Corra las línes que aparecen en GitHub</w:t>
+        <w:rPr>
+          <w:rStyle w:val="VerbatimChar"/>
+        </w:rPr>
+        <w:t>git remote add &lt;SSH-url&gt;</w:t>
+      </w:r>
+      <w:r>
+        <w:t xml:space="preserve"> #conecta remotamente RStudio con el repositorio de GitHub</w:t>
       </w:r>
     </w:p>
     <w:p>
@@ -1142,64 +1188,14 @@
           <w:numId w:val="1"/>
         </w:numPr>
       </w:pPr>
-      <w:proofErr w:type="spellStart"/>
       <w:r>
         <w:rPr>
           <w:rStyle w:val="VerbatimChar"/>
         </w:rPr>
-        <w:t>git</w:t>
-      </w:r>
-      <w:proofErr w:type="spellEnd"/>
-      <w:r>
-        <w:rPr>
-          <w:rStyle w:val="VerbatimChar"/>
-        </w:rPr>
-        <w:t xml:space="preserve"> remote </w:t>
-      </w:r>
-      <w:proofErr w:type="spellStart"/>
-      <w:r>
-        <w:rPr>
-          <w:rStyle w:val="VerbatimChar"/>
-        </w:rPr>
-        <w:t>add</w:t>
-      </w:r>
-      <w:proofErr w:type="spellEnd"/>
-      <w:r>
-        <w:rPr>
-          <w:rStyle w:val="VerbatimChar"/>
-        </w:rPr>
-        <w:t xml:space="preserve"> </w:t>
-      </w:r>
-      <w:proofErr w:type="spellStart"/>
-      <w:r>
-        <w:rPr>
-          <w:rStyle w:val="VerbatimChar"/>
-        </w:rPr>
-        <w:t>origin</w:t>
-      </w:r>
-      <w:proofErr w:type="spellEnd"/>
-      <w:r>
-        <w:rPr>
-          <w:rStyle w:val="VerbatimChar"/>
-        </w:rPr>
-        <w:t xml:space="preserve"> &lt;SSH-</w:t>
-      </w:r>
-      <w:proofErr w:type="spellStart"/>
-      <w:r>
-        <w:rPr>
-          <w:rStyle w:val="VerbatimChar"/>
-        </w:rPr>
-        <w:t>url</w:t>
-      </w:r>
-      <w:proofErr w:type="spellEnd"/>
-      <w:r>
-        <w:rPr>
-          <w:rStyle w:val="VerbatimChar"/>
-        </w:rPr>
-        <w:t>&gt;</w:t>
-      </w:r>
-      <w:r>
-        <w:t>: conecta remotamente RStudio con el repositorio de GitHub</w:t>
+        <w:t>git remote -v</w:t>
+      </w:r>
+      <w:r>
+        <w:t xml:space="preserve"> #Verifica la conexión remota con GitHub</w:t>
       </w:r>
     </w:p>
     <w:p>
@@ -1213,27 +1209,10 @@
         <w:rPr>
           <w:rStyle w:val="VerbatimChar"/>
         </w:rPr>
-        <w:t>git remote -v</w:t>
-      </w:r>
-      <w:r>
-        <w:t>: Verifica la conexión remota con Github</w:t>
-      </w:r>
-    </w:p>
-    <w:p>
-      <w:pPr>
-        <w:numPr>
-          <w:ilvl w:val="0"/>
-          <w:numId w:val="1"/>
-        </w:numPr>
-      </w:pPr>
-      <w:r>
-        <w:rPr>
-          <w:rStyle w:val="VerbatimChar"/>
-        </w:rPr>
         <w:t>git push -u origin main</w:t>
       </w:r>
       <w:r>
-        <w:t>: Envía el proyecto por primera vez al repositorio remoto.</w:t>
+        <w:t xml:space="preserve"> #Envía el proyecto por primera vez al repositorio remoto.</w:t>
       </w:r>
     </w:p>
     <w:p>
@@ -1244,7 +1223,7 @@
         </w:numPr>
       </w:pPr>
       <w:r>
-        <w:t>Construya un archivo “readme” en el repositorio con la descripción del proyecto</w:t>
+        <w:t>Desde la interfaz web de GitHub, cree un archivo README.md con una breve descripción del proyecto.</w:t>
       </w:r>
     </w:p>
     <w:p>
@@ -1255,31 +1234,21 @@
         </w:numPr>
       </w:pPr>
       <w:r>
-        <w:t>Importe el archivo readme a RStudio con la opción “</w:t>
-      </w:r>
+        <w:t>Regrese a RStudio y utilice Pull para descargar el nuevo archivo al proyecto local.</w:t>
+      </w:r>
+    </w:p>
+    <w:p>
+      <w:pPr>
+        <w:pStyle w:val="Heading3"/>
+      </w:pPr>
+      <w:bookmarkStart w:id="10" w:name="lista-de-verificación"/>
+      <w:bookmarkStart w:id="11" w:name="_Toc236073832"/>
       <w:r>
         <w:rPr>
           <w:b/>
           <w:bCs/>
         </w:rPr>
-        <w:t>pull</w:t>
-      </w:r>
-      <w:r>
-        <w:t>”</w:t>
-      </w:r>
-    </w:p>
-    <w:p>
-      <w:pPr>
-        <w:pStyle w:val="Heading3"/>
-      </w:pPr>
-      <w:bookmarkStart w:id="10" w:name="lista-de-verificación"/>
-      <w:bookmarkStart w:id="11" w:name="_Toc235985412"/>
-      <w:r>
-        <w:rPr>
-          <w:b/>
-          <w:bCs/>
-        </w:rPr>
-        <w:t>Lista de Verificación</w:t>
+        <w:t>Lista de verificación</w:t>
       </w:r>
       <w:bookmarkEnd w:id="11"/>
     </w:p>
@@ -1320,7 +1289,7 @@
         <w:pStyle w:val="BodyText"/>
       </w:pPr>
       <w:r>
-        <w:t>□ Primer commit realizado</w:t>
+        <w:t>□ Primer Commit realizado</w:t>
       </w:r>
     </w:p>
     <w:p>
@@ -1328,13 +1297,12 @@
         <w:pStyle w:val="BodyText"/>
       </w:pPr>
       <w:r>
-        <w:t>□ Primer push exitoso</w:t>
+        <w:t>□ Primer Push exitoso</w:t>
       </w:r>
       <w:bookmarkEnd w:id="8"/>
       <w:bookmarkEnd w:id="10"/>
     </w:p>
     <w:sectPr>
-      <w:footerReference w:type="default" r:id="rId10"/>
       <w:footnotePr>
         <w:numRestart w:val="eachSect"/>
       </w:footnotePr>
@@ -1346,115 +1314,12 @@
 </w:document>
 </file>
 
-<file path=word/endnotes.xml><?xml version="1.0" encoding="utf-8"?>
-<w:endnotes xmlns:wpc="http://schemas.microsoft.com/office/word/2010/wordprocessingCanvas" xmlns:cx="http://schemas.microsoft.com/office/drawing/2014/chartex" xmlns:cx1="http://schemas.microsoft.com/office/drawing/2015/9/8/chartex" xmlns:cx2="http://schemas.microsoft.com/office/drawing/2015/10/21/chartex" xmlns:cx3="http://schemas.microsoft.com/office/drawing/2016/5/9/chartex" xmlns:cx4="http://schemas.microsoft.com/office/drawing/2016/5/10/chartex" xmlns:cx5="http://schemas.microsoft.com/office/drawing/2016/5/11/chartex" xmlns:cx6="http://schemas.microsoft.com/office/drawing/2016/5/12/chartex" xmlns:cx7="http://schemas.microsoft.com/office/drawing/2016/5/13/chartex" xmlns:cx8="http://schemas.microsoft.com/office/drawing/2016/5/14/chartex" xmlns:mc="http://schemas.openxmlformats.org/markup-compatibility/2006" xmlns:aink="http://schemas.microsoft.com/office/drawing/2016/ink" xmlns:am3d="http://schemas.microsoft.com/office/drawing/2017/model3d" xmlns:o="urn:schemas-microsoft-com:office:office" xmlns:oel="http://schemas.microsoft.com/office/2019/extlst" xmlns:r="http://schemas.openxmlformats.org/officeDocument/2006/relationships" xmlns:m="http://schemas.openxmlformats.org/officeDocument/2006/math" xmlns:v="urn:schemas-microsoft-com:vml" xmlns:wp14="http://schemas.microsoft.com/office/word/2010/wordprocessingDrawing" xmlns:wp="http://schemas.openxmlformats.org/drawingml/2006/wordprocessingDrawing" xmlns:w10="urn:schemas-microsoft-com:office:word" xmlns:w="http://schemas.openxmlformats.org/wordprocessingml/2006/main" xmlns:w14="http://schemas.microsoft.com/office/word/2010/wordml" xmlns:w15="http://schemas.microsoft.com/office/word/2012/wordml" xmlns:w16cex="http://schemas.microsoft.com/office/word/2018/wordml/cex" xmlns:w16cid="http://schemas.microsoft.com/office/word/2016/wordml/cid" xmlns:w16="http://schemas.microsoft.com/office/word/2018/wordml" xmlns:w16du="http://schemas.microsoft.com/office/word/2023/wordml/word16du" xmlns:w16sdtdh="http://schemas.microsoft.com/office/word/2020/wordml/sdtdatahash" xmlns:w16sdtfl="http://schemas.microsoft.com/office/word/2024/wordml/sdtformatlock" xmlns:w16se="http://schemas.microsoft.com/office/word/2015/wordml/symex" xmlns:wpg="http://schemas.microsoft.com/office/word/2010/wordprocessingGroup" xmlns:wpi="http://schemas.microsoft.com/office/word/2010/wordprocessingInk" xmlns:wne="http://schemas.microsoft.com/office/word/2006/wordml" xmlns:wps="http://schemas.microsoft.com/office/word/2010/wordprocessingShape" mc:Ignorable="w14 w15 w16se w16cid w16 w16cex w16sdtdh w16sdtfl w16du wp14">
-  <w:endnote w:type="separator" w:id="-1">
-    <w:p>
-      <w:pPr>
-        <w:spacing w:after="0"/>
-      </w:pPr>
-      <w:r>
-        <w:separator/>
-      </w:r>
-    </w:p>
-  </w:endnote>
-  <w:endnote w:type="continuationSeparator" w:id="0">
-    <w:p>
-      <w:pPr>
-        <w:spacing w:after="0"/>
-      </w:pPr>
-      <w:r>
-        <w:continuationSeparator/>
-      </w:r>
-    </w:p>
-  </w:endnote>
-</w:endnotes>
-</file>
-
-<file path=word/footer1.xml><?xml version="1.0" encoding="utf-8"?>
-<w:ftr xmlns:wpc="http://schemas.microsoft.com/office/word/2010/wordprocessingCanvas" xmlns:cx="http://schemas.microsoft.com/office/drawing/2014/chartex" xmlns:cx1="http://schemas.microsoft.com/office/drawing/2015/9/8/chartex" xmlns:cx2="http://schemas.microsoft.com/office/drawing/2015/10/21/chartex" xmlns:cx3="http://schemas.microsoft.com/office/drawing/2016/5/9/chartex" xmlns:cx4="http://schemas.microsoft.com/office/drawing/2016/5/10/chartex" xmlns:cx5="http://schemas.microsoft.com/office/drawing/2016/5/11/chartex" xmlns:cx6="http://schemas.microsoft.com/office/drawing/2016/5/12/chartex" xmlns:cx7="http://schemas.microsoft.com/office/drawing/2016/5/13/chartex" xmlns:cx8="http://schemas.microsoft.com/office/drawing/2016/5/14/chartex" xmlns:mc="http://schemas.openxmlformats.org/markup-compatibility/2006" xmlns:aink="http://schemas.microsoft.com/office/drawing/2016/ink" xmlns:am3d="http://schemas.microsoft.com/office/drawing/2017/model3d" xmlns:o="urn:schemas-microsoft-com:office:office" xmlns:oel="http://schemas.microsoft.com/office/2019/extlst" xmlns:r="http://schemas.openxmlformats.org/officeDocument/2006/relationships" xmlns:m="http://schemas.openxmlformats.org/officeDocument/2006/math" xmlns:v="urn:schemas-microsoft-com:vml" xmlns:wp14="http://schemas.microsoft.com/office/word/2010/wordprocessingDrawing" xmlns:wp="http://schemas.openxmlformats.org/drawingml/2006/wordprocessingDrawing" xmlns:w10="urn:schemas-microsoft-com:office:word" xmlns:w="http://schemas.openxmlformats.org/wordprocessingml/2006/main" xmlns:w14="http://schemas.microsoft.com/office/word/2010/wordml" xmlns:w15="http://schemas.microsoft.com/office/word/2012/wordml" xmlns:w16cex="http://schemas.microsoft.com/office/word/2018/wordml/cex" xmlns:w16cid="http://schemas.microsoft.com/office/word/2016/wordml/cid" xmlns:w16="http://schemas.microsoft.com/office/word/2018/wordml" xmlns:w16du="http://schemas.microsoft.com/office/word/2023/wordml/word16du" xmlns:w16sdtdh="http://schemas.microsoft.com/office/word/2020/wordml/sdtdatahash" xmlns:w16sdtfl="http://schemas.microsoft.com/office/word/2024/wordml/sdtformatlock" xmlns:w16se="http://schemas.microsoft.com/office/word/2015/wordml/symex" xmlns:wpg="http://schemas.microsoft.com/office/word/2010/wordprocessingGroup" xmlns:wpi="http://schemas.microsoft.com/office/word/2010/wordprocessingInk" xmlns:wne="http://schemas.microsoft.com/office/word/2006/wordml" xmlns:wps="http://schemas.microsoft.com/office/word/2010/wordprocessingShape" mc:Ignorable="w14 w15 w16se w16cid w16 w16cex w16sdtdh w16sdtfl w16du wp14">
-  <w:sdt>
-    <w:sdtPr>
-      <w:id w:val="-1881085480"/>
-      <w:docPartObj>
-        <w:docPartGallery w:val="Page Numbers (Bottom of Page)"/>
-        <w:docPartUnique/>
-      </w:docPartObj>
-    </w:sdtPr>
-    <w:sdtEndPr>
-      <w:rPr>
-        <w:noProof/>
-      </w:rPr>
-    </w:sdtEndPr>
-    <w:sdtContent>
-      <w:p>
-        <w:pPr>
-          <w:pStyle w:val="Footer"/>
-          <w:jc w:val="right"/>
-        </w:pPr>
-        <w:r>
-          <w:fldChar w:fldCharType="begin"/>
-        </w:r>
-        <w:r>
-          <w:instrText xml:space="preserve"> PAGE   \* MERGEFORMAT </w:instrText>
-        </w:r>
-        <w:r>
-          <w:fldChar w:fldCharType="separate"/>
-        </w:r>
-        <w:r>
-          <w:rPr>
-            <w:noProof/>
-          </w:rPr>
-          <w:t>2</w:t>
-        </w:r>
-        <w:r>
-          <w:rPr>
-            <w:noProof/>
-          </w:rPr>
-          <w:fldChar w:fldCharType="end"/>
-        </w:r>
-      </w:p>
-    </w:sdtContent>
-  </w:sdt>
-  <w:p>
-    <w:pPr>
-      <w:pStyle w:val="Footer"/>
-    </w:pPr>
-  </w:p>
-</w:ftr>
-</file>
-
-<file path=word/footnotes.xml><?xml version="1.0" encoding="utf-8"?>
-<w:footnotes xmlns:wpc="http://schemas.microsoft.com/office/word/2010/wordprocessingCanvas" xmlns:cx="http://schemas.microsoft.com/office/drawing/2014/chartex" xmlns:cx1="http://schemas.microsoft.com/office/drawing/2015/9/8/chartex" xmlns:cx2="http://schemas.microsoft.com/office/drawing/2015/10/21/chartex" xmlns:cx3="http://schemas.microsoft.com/office/drawing/2016/5/9/chartex" xmlns:cx4="http://schemas.microsoft.com/office/drawing/2016/5/10/chartex" xmlns:cx5="http://schemas.microsoft.com/office/drawing/2016/5/11/chartex" xmlns:cx6="http://schemas.microsoft.com/office/drawing/2016/5/12/chartex" xmlns:cx7="http://schemas.microsoft.com/office/drawing/2016/5/13/chartex" xmlns:cx8="http://schemas.microsoft.com/office/drawing/2016/5/14/chartex" xmlns:mc="http://schemas.openxmlformats.org/markup-compatibility/2006" xmlns:aink="http://schemas.microsoft.com/office/drawing/2016/ink" xmlns:am3d="http://schemas.microsoft.com/office/drawing/2017/model3d" xmlns:o="urn:schemas-microsoft-com:office:office" xmlns:oel="http://schemas.microsoft.com/office/2019/extlst" xmlns:r="http://schemas.openxmlformats.org/officeDocument/2006/relationships" xmlns:m="http://schemas.openxmlformats.org/officeDocument/2006/math" xmlns:v="urn:schemas-microsoft-com:vml" xmlns:wp14="http://schemas.microsoft.com/office/word/2010/wordprocessingDrawing" xmlns:wp="http://schemas.openxmlformats.org/drawingml/2006/wordprocessingDrawing" xmlns:w10="urn:schemas-microsoft-com:office:word" xmlns:w="http://schemas.openxmlformats.org/wordprocessingml/2006/main" xmlns:w14="http://schemas.microsoft.com/office/word/2010/wordml" xmlns:w15="http://schemas.microsoft.com/office/word/2012/wordml" xmlns:w16cex="http://schemas.microsoft.com/office/word/2018/wordml/cex" xmlns:w16cid="http://schemas.microsoft.com/office/word/2016/wordml/cid" xmlns:w16="http://schemas.microsoft.com/office/word/2018/wordml" xmlns:w16du="http://schemas.microsoft.com/office/word/2023/wordml/word16du" xmlns:w16sdtdh="http://schemas.microsoft.com/office/word/2020/wordml/sdtdatahash" xmlns:w16sdtfl="http://schemas.microsoft.com/office/word/2024/wordml/sdtformatlock" xmlns:w16se="http://schemas.microsoft.com/office/word/2015/wordml/symex" xmlns:wpg="http://schemas.microsoft.com/office/word/2010/wordprocessingGroup" xmlns:wpi="http://schemas.microsoft.com/office/word/2010/wordprocessingInk" xmlns:wne="http://schemas.microsoft.com/office/word/2006/wordml" xmlns:wps="http://schemas.microsoft.com/office/word/2010/wordprocessingShape" mc:Ignorable="w14 w15 w16se w16cid w16 w16cex w16sdtdh w16sdtfl w16du wp14">
-  <w:footnote w:type="separator" w:id="-1">
-    <w:p>
-      <w:pPr>
-        <w:spacing w:after="0"/>
-      </w:pPr>
-      <w:r>
-        <w:separator/>
-      </w:r>
-    </w:p>
-  </w:footnote>
-  <w:footnote w:type="continuationSeparator" w:id="0">
-    <w:p>
-      <w:pPr>
-        <w:spacing w:after="0"/>
-      </w:pPr>
-      <w:r>
-        <w:continuationSeparator/>
-      </w:r>
-    </w:p>
-  </w:footnote>
-</w:footnotes>
-</file>
-
 <file path=word/numbering.xml><?xml version="1.0" encoding="utf-8"?>
 <w:numbering xmlns:wpc="http://schemas.microsoft.com/office/word/2010/wordprocessingCanvas" xmlns:cx="http://schemas.microsoft.com/office/drawing/2014/chartex" xmlns:cx1="http://schemas.microsoft.com/office/drawing/2015/9/8/chartex" xmlns:cx2="http://schemas.microsoft.com/office/drawing/2015/10/21/chartex" xmlns:cx3="http://schemas.microsoft.com/office/drawing/2016/5/9/chartex" xmlns:cx4="http://schemas.microsoft.com/office/drawing/2016/5/10/chartex" xmlns:cx5="http://schemas.microsoft.com/office/drawing/2016/5/11/chartex" xmlns:cx6="http://schemas.microsoft.com/office/drawing/2016/5/12/chartex" xmlns:cx7="http://schemas.microsoft.com/office/drawing/2016/5/13/chartex" xmlns:cx8="http://schemas.microsoft.com/office/drawing/2016/5/14/chartex" xmlns:mc="http://schemas.openxmlformats.org/markup-compatibility/2006" xmlns:aink="http://schemas.microsoft.com/office/drawing/2016/ink" xmlns:am3d="http://schemas.microsoft.com/office/drawing/2017/model3d" xmlns:o="urn:schemas-microsoft-com:office:office" xmlns:oel="http://schemas.microsoft.com/office/2019/extlst" xmlns:r="http://schemas.openxmlformats.org/officeDocument/2006/relationships" xmlns:m="http://schemas.openxmlformats.org/officeDocument/2006/math" xmlns:v="urn:schemas-microsoft-com:vml" xmlns:wp14="http://schemas.microsoft.com/office/word/2010/wordprocessingDrawing" xmlns:wp="http://schemas.openxmlformats.org/drawingml/2006/wordprocessingDrawing" xmlns:w10="urn:schemas-microsoft-com:office:word" xmlns:w="http://schemas.openxmlformats.org/wordprocessingml/2006/main" xmlns:w14="http://schemas.microsoft.com/office/word/2010/wordml" xmlns:w15="http://schemas.microsoft.com/office/word/2012/wordml" xmlns:w16cex="http://schemas.microsoft.com/office/word/2018/wordml/cex" xmlns:w16cid="http://schemas.microsoft.com/office/word/2016/wordml/cid" xmlns:w16="http://schemas.microsoft.com/office/word/2018/wordml" xmlns:w16du="http://schemas.microsoft.com/office/word/2023/wordml/word16du" xmlns:w16sdtdh="http://schemas.microsoft.com/office/word/2020/wordml/sdtdatahash" xmlns:w16sdtfl="http://schemas.microsoft.com/office/word/2024/wordml/sdtformatlock" xmlns:w16se="http://schemas.microsoft.com/office/word/2015/wordml/symex" xmlns:wpg="http://schemas.microsoft.com/office/word/2010/wordprocessingGroup" xmlns:wpi="http://schemas.microsoft.com/office/word/2010/wordprocessingInk" xmlns:wne="http://schemas.microsoft.com/office/word/2006/wordml" xmlns:wps="http://schemas.microsoft.com/office/word/2010/wordprocessingShape" mc:Ignorable="w14 w15 w16se w16cid w16 w16cex w16sdtdh w16sdtfl w16du wp14">
   <w:abstractNum w:abstractNumId="0" w15:restartNumberingAfterBreak="0">
     <w:nsid w:val="0000A990"/>
     <w:multiLevelType w:val="multilevel"/>
-    <w:tmpl w:val="4CA6028A"/>
+    <w:tmpl w:val="47EA4DA4"/>
     <w:lvl w:ilvl="0">
       <w:numFmt w:val="bullet"/>
       <w:lvlText w:val=" "/>
@@ -1531,7 +1396,7 @@
   <w:abstractNum w:abstractNumId="1" w15:restartNumberingAfterBreak="0">
     <w:nsid w:val="00A99411"/>
     <w:multiLevelType w:val="multilevel"/>
-    <w:tmpl w:val="20AA6BAA"/>
+    <w:tmpl w:val="0B841A0E"/>
     <w:lvl w:ilvl="0">
       <w:start w:val="1"/>
       <w:numFmt w:val="decimal"/>
@@ -1614,96 +1479,10 @@
       </w:pPr>
     </w:lvl>
   </w:abstractNum>
-  <w:abstractNum w:abstractNumId="2" w15:restartNumberingAfterBreak="0">
-    <w:nsid w:val="0F8C1107"/>
-    <w:multiLevelType w:val="hybridMultilevel"/>
-    <w:tmpl w:val="EAC08F32"/>
-    <w:lvl w:ilvl="0" w:tplc="140A000F">
-      <w:start w:val="1"/>
-      <w:numFmt w:val="decimal"/>
-      <w:lvlText w:val="%1."/>
-      <w:lvlJc w:val="left"/>
-      <w:pPr>
-        <w:ind w:left="720" w:hanging="360"/>
-      </w:pPr>
-    </w:lvl>
-    <w:lvl w:ilvl="1" w:tplc="140A0019" w:tentative="1">
-      <w:start w:val="1"/>
-      <w:numFmt w:val="lowerLetter"/>
-      <w:lvlText w:val="%2."/>
-      <w:lvlJc w:val="left"/>
-      <w:pPr>
-        <w:ind w:left="1440" w:hanging="360"/>
-      </w:pPr>
-    </w:lvl>
-    <w:lvl w:ilvl="2" w:tplc="140A001B" w:tentative="1">
-      <w:start w:val="1"/>
-      <w:numFmt w:val="lowerRoman"/>
-      <w:lvlText w:val="%3."/>
-      <w:lvlJc w:val="right"/>
-      <w:pPr>
-        <w:ind w:left="2160" w:hanging="180"/>
-      </w:pPr>
-    </w:lvl>
-    <w:lvl w:ilvl="3" w:tplc="140A000F" w:tentative="1">
-      <w:start w:val="1"/>
-      <w:numFmt w:val="decimal"/>
-      <w:lvlText w:val="%4."/>
-      <w:lvlJc w:val="left"/>
-      <w:pPr>
-        <w:ind w:left="2880" w:hanging="360"/>
-      </w:pPr>
-    </w:lvl>
-    <w:lvl w:ilvl="4" w:tplc="140A0019" w:tentative="1">
-      <w:start w:val="1"/>
-      <w:numFmt w:val="lowerLetter"/>
-      <w:lvlText w:val="%5."/>
-      <w:lvlJc w:val="left"/>
-      <w:pPr>
-        <w:ind w:left="3600" w:hanging="360"/>
-      </w:pPr>
-    </w:lvl>
-    <w:lvl w:ilvl="5" w:tplc="140A001B" w:tentative="1">
-      <w:start w:val="1"/>
-      <w:numFmt w:val="lowerRoman"/>
-      <w:lvlText w:val="%6."/>
-      <w:lvlJc w:val="right"/>
-      <w:pPr>
-        <w:ind w:left="4320" w:hanging="180"/>
-      </w:pPr>
-    </w:lvl>
-    <w:lvl w:ilvl="6" w:tplc="140A000F" w:tentative="1">
-      <w:start w:val="1"/>
-      <w:numFmt w:val="decimal"/>
-      <w:lvlText w:val="%7."/>
-      <w:lvlJc w:val="left"/>
-      <w:pPr>
-        <w:ind w:left="5040" w:hanging="360"/>
-      </w:pPr>
-    </w:lvl>
-    <w:lvl w:ilvl="7" w:tplc="140A0019" w:tentative="1">
-      <w:start w:val="1"/>
-      <w:numFmt w:val="lowerLetter"/>
-      <w:lvlText w:val="%8."/>
-      <w:lvlJc w:val="left"/>
-      <w:pPr>
-        <w:ind w:left="5760" w:hanging="360"/>
-      </w:pPr>
-    </w:lvl>
-    <w:lvl w:ilvl="8" w:tplc="140A001B" w:tentative="1">
-      <w:start w:val="1"/>
-      <w:numFmt w:val="lowerRoman"/>
-      <w:lvlText w:val="%9."/>
-      <w:lvlJc w:val="right"/>
-      <w:pPr>
-        <w:ind w:left="6480" w:hanging="180"/>
-      </w:pPr>
-    </w:lvl>
-  </w:abstractNum>
-  <w:num w:numId="1" w16cid:durableId="2104648663">
+  <w:num w:numId="1" w16cid:durableId="1600143265">
     <w:abstractNumId w:val="0"/>
   </w:num>
-  <w:num w:numId="2" w16cid:durableId="123817207">
+  <w:num w:numId="2" w16cid:durableId="536309768">
     <w:abstractNumId w:val="1"/>
     <w:lvlOverride w:ilvl="0">
       <w:startOverride w:val="1"/>
@@ -1733,9 +1512,6 @@
       <w:startOverride w:val="1"/>
     </w:lvlOverride>
   </w:num>
-  <w:num w:numId="3" w16cid:durableId="928463355">
-    <w:abstractNumId w:val="2"/>
-  </w:num>
 </w:numbering>
 </file>
 
@@ -1759,7 +1535,6 @@
   <w:latentStyles w:defLockedState="0" w:defUIPriority="0" w:defSemiHidden="0" w:defUnhideWhenUsed="0" w:defQFormat="0" w:count="376">
     <w:lsdException w:name="toc 2" w:uiPriority="39"/>
     <w:lsdException w:name="toc 3" w:uiPriority="39"/>
-    <w:lsdException w:name="footer" w:uiPriority="99"/>
     <w:lsdException w:name="Hyperlink" w:uiPriority="99"/>
     <w:lsdException w:name="Normal Table" w:semiHidden="1" w:unhideWhenUsed="1"/>
     <w:lsdException w:name="Table Simple 1" w:semiHidden="1" w:unhideWhenUsed="1"/>
@@ -2984,7 +2759,7 @@
     <w:next w:val="Normal"/>
     <w:autoRedefine/>
     <w:uiPriority w:val="39"/>
-    <w:rsid w:val="00161012"/>
+    <w:rsid w:val="00A25ECB"/>
     <w:pPr>
       <w:spacing w:after="100"/>
       <w:ind w:left="240"/>
@@ -2996,51 +2771,11 @@
     <w:next w:val="Normal"/>
     <w:autoRedefine/>
     <w:uiPriority w:val="39"/>
-    <w:rsid w:val="00161012"/>
+    <w:rsid w:val="00A25ECB"/>
     <w:pPr>
       <w:spacing w:after="100"/>
       <w:ind w:left="480"/>
     </w:pPr>
-  </w:style>
-  <w:style w:type="paragraph" w:styleId="Header">
-    <w:name w:val="header"/>
-    <w:basedOn w:val="Normal"/>
-    <w:link w:val="HeaderChar"/>
-    <w:rsid w:val="00161012"/>
-    <w:pPr>
-      <w:tabs>
-        <w:tab w:val="center" w:pos="4419"/>
-        <w:tab w:val="right" w:pos="8838"/>
-      </w:tabs>
-      <w:spacing w:after="0"/>
-    </w:pPr>
-  </w:style>
-  <w:style w:type="character" w:customStyle="1" w:styleId="HeaderChar">
-    <w:name w:val="Header Char"/>
-    <w:basedOn w:val="DefaultParagraphFont"/>
-    <w:link w:val="Header"/>
-    <w:rsid w:val="00161012"/>
-  </w:style>
-  <w:style w:type="paragraph" w:styleId="Footer">
-    <w:name w:val="footer"/>
-    <w:basedOn w:val="Normal"/>
-    <w:link w:val="FooterChar"/>
-    <w:uiPriority w:val="99"/>
-    <w:rsid w:val="00161012"/>
-    <w:pPr>
-      <w:tabs>
-        <w:tab w:val="center" w:pos="4419"/>
-        <w:tab w:val="right" w:pos="8838"/>
-      </w:tabs>
-      <w:spacing w:after="0"/>
-    </w:pPr>
-  </w:style>
-  <w:style w:type="character" w:customStyle="1" w:styleId="FooterChar">
-    <w:name w:val="Footer Char"/>
-    <w:basedOn w:val="DefaultParagraphFont"/>
-    <w:link w:val="Footer"/>
-    <w:uiPriority w:val="99"/>
-    <w:rsid w:val="00161012"/>
   </w:style>
 </w:styles>
 </file>

</xml_diff>